<commit_message>
Correct GTCN-G comparison after reading the paper PDF
- State that the paper's UNSW-NB15 data has 700,001 flows (Table I)
  against 2,042,340 in ours, with a different class mix
- Fix the learning-rate wording: 0.007 is in the paper's shared
  training settings, so it probably applies to its baselines too
- Note that Worms would be about 6 test flows in the paper's data
- Add the paper link (arxiv.org/abs/2510.07285) to the README and
  the comparison doc
- Update the report, literature comparison, analysis.md and the
  notebook A intro to match
</commit_message>
<xml_diff>
--- a/Our_Work/documents/UNSW-NB15-GTCN-G-Comparison.docx
+++ b/Our_Work/documents/UNSW-NB15-GTCN-G-Comparison.docx
@@ -41,7 +41,7 @@
         <w:rPr>
           <w:i w:val="0"/>
         </w:rPr>
-        <w:t>We were asked to analyse one paper, GTCN-G (Xu, Wen, Zhao, Hu, Li and Liu, arXiv 2510.07285, a preprint submitted to IEEE TrustCom 2025), to replicate its split and strategy as closely as possible, and to see whether our results improve on it. This document compares our results with that paper only. Other related papers are in UNSW-NB15-Literature-Comparison.docx.</w:t>
+        <w:t>We were asked to analyse one paper, GTCN-G (Xu, Wen, Zhao, Hu, Li and Liu, arXiv 2510.07285, a preprint submitted to IEEE TrustCom 2025; https://arxiv.org/abs/2510.07285), to replicate its split and strategy as closely as possible, and to see whether our results improve on it. This document compares our results with that paper only. Other related papers are in UNSW-NB15-Literature-Comparison.docx.</w:t>
       </w:r>
     </w:p>
     <w:p>
@@ -72,7 +72,7 @@
         <w:spacing w:after="40"/>
       </w:pPr>
       <w:r>
-        <w:t>We cannot call this an improvement. We could not reproduce the paper's own baselines (our E-GraphSAGE-M style network scores 0.981, the paper reports 0.8934 for E-GraphSAGE-M), and a tree model with no graph scores the same as the graph models. The paper leaves out its preprocessing, the way the split was made, the loss and the optimizer, so the gap is probably a difference in setup.</w:t>
+        <w:t>We cannot call this an improvement. We could not reproduce the paper's own baselines (our E-GraphSAGE-M style network scores 0.981, the paper reports 0.8934 for E-GraphSAGE-M), and a tree model with no graph scores the same as the graph models. The paper leaves out its preprocessing, the way the split was made, the loss and the optimizer, so the gap is probably a difference in setup and data (its UNSW-NB15 set has 700,001 flows, ours 2,042,340).</w:t>
       </w:r>
     </w:p>
     <w:p>
@@ -106,7 +106,7 @@
         <w:rPr>
           <w:i w:val="0"/>
         </w:rPr>
-        <w:t>The details below were extracted from the arXiv HTML version of the paper. Numbers in Table 1 of this document should be checked against the PDF before they are cited. The paper has no per-class scores (only confusion-matrix figures) and we found no code link.</w:t>
+        <w:t>The details below are from the PDF of arXiv version 3 (14 April 2026), read in full; the numbers in Table 1 of this document match its Table IV. The paper has no per-class scores (only confusion-matrix figures) and we found no code link.</w:t>
       </w:r>
     </w:p>
     <w:tbl>
@@ -191,7 +191,43 @@
               <w:rPr>
                 <w:sz w:val="20"/>
               </w:rPr>
-              <w:t>UNSW-NB15 and ToN-IoT. For UNSW-NB15 'the full set of provided instances is used'; file names are not given.</w:t>
+              <w:t>UNSW-NB15 and ToN-IoT. For UNSW-NB15 'the full set of provided instances is used'; its Table I lists 700,001 examples, 43 features and 96.83% Normal. File names are not given.</w:t>
+            </w:r>
+          </w:p>
+        </w:tc>
+      </w:tr>
+      <w:tr>
+        <w:tc>
+          <w:tcPr>
+            <w:tcW w:type="dxa" w:w="1872"/>
+          </w:tcPr>
+          <w:p>
+            <w:pPr>
+              <w:spacing w:after="20"/>
+            </w:pPr>
+            <w:r/>
+            <w:r>
+              <w:rPr>
+                <w:sz w:val="20"/>
+              </w:rPr>
+              <w:t>Class mix</w:t>
+            </w:r>
+          </w:p>
+        </w:tc>
+        <w:tc>
+          <w:tcPr>
+            <w:tcW w:type="dxa" w:w="7488"/>
+          </w:tcPr>
+          <w:p>
+            <w:pPr>
+              <w:spacing w:after="20"/>
+            </w:pPr>
+            <w:r/>
+            <w:r>
+              <w:rPr>
+                <w:sz w:val="20"/>
+              </w:rPr>
+              <w:t>Table II, UNSW-NB15: Normal 96.83%, Generic 1.07, Exploits 0.773, Fuzzers 0.722, Reconnaissance 0.251, DoS 0.167, Backdoor 0.076, Analysis 0.075, Shellcode 0.032, Worms 0.003. By our calculation from these rounded percentages Worms is about 20 flows in all and about 6 in a 30% test set.</w:t>
             </w:r>
           </w:p>
         </w:tc>
@@ -407,7 +443,7 @@
               <w:rPr>
                 <w:sz w:val="20"/>
               </w:rPr>
-              <w:t>10 epochs, mini-batches of 500, learning rate 0.007 for UNSW-NB15 (0.01 for ToN-IoT). Optimizer, loss and class weighting are not stated.</w:t>
+              <w:t>10 epochs, mini-batches of 500, learning rate 0.007 for UNSW-NB15 (0.01 for ToN-IoT), given in the settings shared by all models ('learning rates were optimized on the validation set'). Optimizer, loss and class weighting are not stated.</w:t>
             </w:r>
           </w:p>
         </w:tc>
@@ -956,7 +992,7 @@
               <w:rPr>
                 <w:sz w:val="20"/>
               </w:rPr>
-              <w:t>Full UNSW-NB15</w:t>
+              <w:t>UNSW-NB15, 700,001 examples, 43 features, 96.83% Normal (Table I)</w:t>
             </w:r>
           </w:p>
         </w:tc>
@@ -973,7 +1009,7 @@
               <w:rPr>
                 <w:sz w:val="20"/>
               </w:rPr>
-              <w:t>UNSW-NB15 with duplicates removed (2,042,340 of 2,540,047 flows) and 45 selected features</w:t>
+              <w:t>UNSW-NB15 with duplicates removed (2,042,340 of 2,540,047 flows), 45 selected features, Normal 95.4% of the test set</w:t>
             </w:r>
           </w:p>
         </w:tc>
@@ -990,7 +1026,7 @@
               <w:rPr>
                 <w:sz w:val="20"/>
               </w:rPr>
-              <w:t>Approximate</w:t>
+              <w:t>Different size and class mix</w:t>
             </w:r>
           </w:p>
         </w:tc>
@@ -1376,7 +1412,7 @@
               <w:rPr>
                 <w:sz w:val="20"/>
               </w:rPr>
-              <w:t>0.007 for GTCN-G; baselines not stated</w:t>
+              <w:t>0.007, given in the shared settings (probably all models)</w:t>
             </w:r>
           </w:p>
         </w:tc>
@@ -2684,7 +2720,7 @@
         <w:t xml:space="preserve">Their baselines did not reproduce. </w:t>
       </w:r>
       <w:r>
-        <w:t>Our E-GraphSAGE-M style network scores 0.981 where the paper reports 0.8934 for its version of the same model. Preprocessing, the split method, loss and learning rate may all differ, so we do not read our higher numbers as a better model.</w:t>
+        <w:t>Our E-GraphSAGE-M style network scores 0.981 where the paper reports 0.8934 for its version of the same model. Preprocessing, the split method, loss and learning rate may all differ, The paper's data also has about a third as many flows as ours, with a different class mix, which may contribute too. We do not read our higher numbers as a better model.</w:t>
       </w:r>
     </w:p>
     <w:p>
@@ -2744,7 +2780,7 @@
         <w:t xml:space="preserve">Rare classes. </w:t>
       </w:r>
       <w:r>
-        <w:t>The paper states that it detects Worms and Shellcode and shows confusion matrices, but gives no per-class scores. In our test set Worms has only 51 rows, so its F1 is noisy: 0.278 for our E-GraphSAGE-M style network, 0.665 for class-weighted LightGBM, 0.299 for the improved GNN with the graph. Shellcode (454 rows) is 0.866, 0.903 and 0.855 for the same three. Analysis stays below 0.25 and Backdoor below 0.29 in every model.</w:t>
+        <w:t>The paper states that it detects Worms and Shellcode and shows confusion matrices, but gives no per-class scores. In our test set Worms has only 51 rows, so its F1 is noisy (in the paper's 700,001 flows a 30% test set would hold only about 6 Worms flows, so its Worms result rests on very few flows): 0.278 for our E-GraphSAGE-M style network, 0.665 for class-weighted LightGBM, 0.299 for the improved GNN with the graph. Shellcode (454 rows) is 0.866, 0.903 and 0.855 for the same three. Analysis stays below 0.25 and Backdoor below 0.29 in every model.</w:t>
       </w:r>
     </w:p>
     <w:p>
@@ -2785,7 +2821,7 @@
         <w:spacing w:after="40"/>
       </w:pPr>
       <w:r>
-        <w:t>We used deduplicated data and a stratified random split. A run that keeps duplicate rows, or a split of another kind, was not tried and could change the numbers.</w:t>
+        <w:t>Our data has 2,042,340 flows, the paper's 700,001, so even with the same split ratio the test sets differ in size and class mix. We used deduplicated data and a stratified random split. A run that keeps duplicate rows, or a split of another kind, was not tried and could change the numbers.</w:t>
       </w:r>
     </w:p>
     <w:p>
@@ -2794,7 +2830,7 @@
         <w:spacing w:after="40"/>
       </w:pPr>
       <w:r>
-        <w:t>Our learning rate for the baseline (0.001) differs from the paper's 0.007 because 0.007 collapsed in our runs. The paper gives that value for GTCN-G, not for its baselines.</w:t>
+        <w:t>Our learning rate for the baseline (0.001) differs from the paper's 0.007 because 0.007 collapsed in our runs. The paper gives 0.007 in its shared settings, so it probably used it for its baselines too; with our data and network it did not train.</w:t>
       </w:r>
     </w:p>
     <w:p>
@@ -2821,7 +2857,7 @@
         <w:spacing w:after="40"/>
       </w:pPr>
       <w:r>
-        <w:t>The paper is a preprint. We did not check whether a later version adds details.</w:t>
+        <w:t>We read arXiv version 3 (14 April 2026) of the paper, a preprint; earlier versions were not compared.</w:t>
       </w:r>
     </w:p>
     <w:p>
@@ -2839,6 +2875,15 @@
       </w:pPr>
       <w:r>
         <w:t>Ask the authors for their code or for the split, preprocessing and loss, or check whether a published version gives them.</w:t>
+      </w:r>
+    </w:p>
+    <w:p>
+      <w:pPr>
+        <w:pStyle w:val="ListBullet"/>
+        <w:spacing w:after="40"/>
+      </w:pPr>
+      <w:r>
+        <w:t>Find out which rows the paper's 700,001 flows are (the count may match one of the four raw UNSW-NB15 CSV files, probably the first; not verified) and run our models on that subset with the 5:2:3 split.</w:t>
       </w:r>
     </w:p>
     <w:p>
@@ -2881,7 +2926,7 @@
         <w:rPr>
           <w:i/>
         </w:rPr>
-        <w:t>"We replicated the stated setup of GTCN-G on our data (5:2:3 split, E-GraphSAGE-M style baseline, batches of 500, 10 epochs). Several settings are not in the paper, so it is not an exact replication. Our models reach a weighted F1 of 0.980 to 0.984 against the 0.9512 the paper reports, but we could not reproduce its baselines (0.981 against 0.8934), and a tree model without a graph scores the same, so we do not claim an improvement over GTCN-G. On macro F1, which the paper does not report, validation-tuned class weights and class scales reached 0.667, and the graph did not help in our tests. The next steps are to obtain the paper's missing details and to test a version of the data with duplicates kept."</w:t>
+        <w:t>"We replicated the stated setup of GTCN-G on our data (5:2:3 split, E-GraphSAGE-M style baseline, batches of 500, 10 epochs). Several settings are not in the paper, so it is not an exact replication. Our models reach a weighted F1 of 0.980 to 0.984 against the 0.9512 the paper reports, but we could not reproduce its baselines (0.981 against 0.8934), and a tree model without a graph scores the same, so we do not claim an improvement over GTCN-G. Its UNSW-NB15 set also has 700,001 flows against our 2,042,340. On macro F1, which the paper does not report, validation-tuned class weights and class scales reached 0.667, and the graph did not help in our tests. The next steps are to obtain the paper's missing details and to test a version of the data with duplicates kept."</w:t>
       </w:r>
     </w:p>
     <w:sectPr>

</xml_diff>

<commit_message>
Fix metric description and add missing paper details to comparison docs
</commit_message>
<xml_diff>
--- a/Our_Work/documents/UNSW-NB15-GTCN-G-Comparison.docx
+++ b/Our_Work/documents/UNSW-NB15-GTCN-G-Comparison.docx
@@ -81,7 +81,7 @@
         <w:spacing w:after="40"/>
       </w:pPr>
       <w:r>
-        <w:t>The paper reports weighted F1 only. On macro F1, which counts every class equally, our best model reaches 0.667 and the network that mimics the paper's baseline reaches 0.581. Analysis and Backdoor stay low in every model.</w:t>
+        <w:t>The paper reports F1 only (weighted F1 for the 10-class task). On macro F1, which counts every class equally, our best model reaches 0.667 and the network that mimics the paper's baseline reaches 0.581. Analysis and Backdoor stay low in every model.</w:t>
       </w:r>
     </w:p>
     <w:p>
@@ -407,7 +407,7 @@
               <w:rPr>
                 <w:sz w:val="20"/>
               </w:rPr>
-              <w:t>A residual graph-temporal fusion network: gated temporal convolution with graph convolution and a 6-head attention (attention dropout 0.5).</w:t>
+              <w:t>A residual graph-temporal fusion network: gated temporal convolution with graph convolution and a 6-head attention (attention dropout 0.5). The number of layers was tuned on validation but its value is not given, and how the temporal input sequences are built from the flows is not described.</w:t>
             </w:r>
           </w:p>
         </w:tc>
@@ -479,7 +479,7 @@
               <w:rPr>
                 <w:sz w:val="20"/>
               </w:rPr>
-              <w:t>E-GraphSAGE (original), E-GraphSAGE-M (mini-batch version: two layers, mean aggregator, ReLU, 2-hop sampling with 8 neighbours per hop) and GAT, run on the same split. Their hyperparameters are not fully given. No tree models and no network without the graph are among them.</w:t>
+              <w:t>E-GraphSAGE (original), E-GraphSAGE-M (mini-batch version: two layers, mean aggregator, ReLU, 2-hop sampling with 8 neighbours per hop) and GAT, run on the same split. GAT is described as a standard GAT used to ablate the residual connections. Their hyperparameters are not fully given, and it is not clear whether the paper's E-GraphSAGE-M includes the paper's own modification (adding the flow's original features to the final edge embedding, its Eq. 4). No tree models and no network without the graph are among them.</w:t>
             </w:r>
           </w:p>
         </w:tc>
@@ -515,7 +515,7 @@
               <w:rPr>
                 <w:sz w:val="20"/>
               </w:rPr>
-              <w:t>Weighted F1, for the binary and the 10-class task.</w:t>
+              <w:t>F1. For the 10-class task it states weighted F1. For the binary task it says only 'F1-score' and defines TP as attacks correctly classified, which suggests F1 of the attack class; the averaging is not stated.</w:t>
             </w:r>
           </w:p>
         </w:tc>
@@ -1517,6 +1517,76 @@
                 <w:sz w:val="20"/>
               </w:rPr>
               <w:t>Unknown</w:t>
+            </w:r>
+          </w:p>
+        </w:tc>
+      </w:tr>
+      <w:tr>
+        <w:tc>
+          <w:tcPr>
+            <w:tcW w:type="dxa" w:w="1728"/>
+          </w:tcPr>
+          <w:p>
+            <w:pPr>
+              <w:spacing w:after="20"/>
+            </w:pPr>
+            <w:r/>
+            <w:r>
+              <w:rPr>
+                <w:sz w:val="20"/>
+              </w:rPr>
+              <w:t>Flow features in the final edge embedding</w:t>
+            </w:r>
+          </w:p>
+        </w:tc>
+        <w:tc>
+          <w:tcPr>
+            <w:tcW w:type="dxa" w:w="2592"/>
+          </w:tcPr>
+          <w:p>
+            <w:pPr>
+              <w:spacing w:after="20"/>
+            </w:pPr>
+            <w:r/>
+            <w:r>
+              <w:rPr>
+                <w:sz w:val="20"/>
+              </w:rPr>
+              <w:t>Eq. 4 adds them in the paper's framework; unclear for its baselines</w:t>
+            </w:r>
+          </w:p>
+        </w:tc>
+        <w:tc>
+          <w:tcPr>
+            <w:tcW w:type="dxa" w:w="3744"/>
+          </w:tcPr>
+          <w:p>
+            <w:pPr>
+              <w:spacing w:after="20"/>
+            </w:pPr>
+            <w:r/>
+            <w:r>
+              <w:rPr>
+                <w:sz w:val="20"/>
+              </w:rPr>
+              <w:t>Not in the E-GraphSAGE-M style network; yes in the improved GNN</w:t>
+            </w:r>
+          </w:p>
+        </w:tc>
+        <w:tc>
+          <w:tcPr>
+            <w:tcW w:type="dxa" w:w="1440"/>
+          </w:tcPr>
+          <w:p>
+            <w:pPr>
+              <w:spacing w:after="20"/>
+            </w:pPr>
+            <w:r/>
+            <w:r>
+              <w:rPr>
+                <w:sz w:val="20"/>
+              </w:rPr>
+              <w:t>Unclear</w:t>
             </w:r>
           </w:p>
         </w:tc>

</xml_diff>

<commit_message>
Explain the score ceiling and add conformal sets of classes
- Show that dropped raw columns, IP addresses and time order do not
  separate Analysis, Backdoor and DoS from the classes they overlap with,
  and that the paper's subset has only 40 source and 44 destination IPs
- Add class-conditional conformal sets: one flat design (sets too large)
  and a two-stage design (detect attacks, then a set over 9 attack classes)
  with a top-k comparison
- Add the three notebooks and their figures and CSVs
- Update the README, analysis.md (section 14), the report (7.7), the
  literature comparison (C16) and the GTCN-G comparison document
</commit_message>
<xml_diff>
--- a/Our_Work/documents/UNSW-NB15-GTCN-G-Comparison.docx
+++ b/Our_Work/documents/UNSW-NB15-GTCN-G-Comparison.docx
@@ -126,10 +126,25 @@
         <w:rPr>
           <w:b/>
         </w:rPr>
+        <w:t xml:space="preserve">Why the scores stop, and what can be done. </w:t>
+      </w:r>
+      <w:r>
+        <w:t>Neither the raw columns we had dropped, nor the IP addresses, nor the time order separate the overlapping classes, and the data has only 40 source and 44 destination hosts, so a graph has little to add. What can be reported is a set of possible classes instead of one label: sets of about 2.3 to 2.7 of the 9 attack classes hold the true class of Analysis, Backdoor and DoS flows for 83% to 92% of detected flows (target 90%), against 20% to 35% for a single label. These sets are no more efficient than a fixed top-3; they add a coverage statement.</w:t>
+      </w:r>
+    </w:p>
+    <w:p>
+      <w:pPr>
+        <w:pStyle w:val="ListBullet"/>
+        <w:spacing w:after="40"/>
+      </w:pPr>
+      <w:r>
+        <w:rPr>
+          <w:b/>
+        </w:rPr>
         <w:t xml:space="preserve">What we claim. </w:t>
       </w:r>
       <w:r>
-        <w:t>A data-grounded re-evaluation of the paper: its data, its trivial baseline, the contribution of each of its ideas, and the limit on its minority-class goal. We do not claim a model that beats GTCN-G, and we did not obtain the authors' code.</w:t>
+        <w:t>A data-grounded re-evaluation of the paper: its data, its trivial baseline, the contribution of each of its ideas, the limit on its minority-class goal and a way to report that limit (conformal sets). We do not claim a model that beats GTCN-G, and we did not obtain the authors' code.</w:t>
       </w:r>
     </w:p>
     <w:p>
@@ -2375,7 +2390,7 @@
         <w:rPr>
           <w:i w:val="0"/>
         </w:rPr>
-        <w:t>Test scores, mean ± standard deviation over 3 training seeds, on the 5:2:3 split of all 2,042,340 flows. The 95% interval is a bootstrap over the test set, from the seed-42 predictions.</w:t>
+        <w:t>Test scores, mean +/- standard deviation over 3 training seeds, on the 5:2:3 split of all 2,042,340 flows. The 95% interval is a bootstrap over the test set, from the seed-42 predictions.</w:t>
       </w:r>
     </w:p>
     <w:tbl>
@@ -2776,7 +2791,7 @@
               <w:rPr>
                 <w:sz w:val="20"/>
               </w:rPr>
-              <w:t>0.9808 ± 0.0009</w:t>
+              <w:t>0.9808 +/- 0.0009</w:t>
             </w:r>
           </w:p>
         </w:tc>
@@ -2793,7 +2808,7 @@
               <w:rPr>
                 <w:sz w:val="20"/>
               </w:rPr>
-              <w:t>0.536 ± 0.001</w:t>
+              <w:t>0.536 +/- 0.001</w:t>
             </w:r>
           </w:p>
         </w:tc>
@@ -2845,7 +2860,7 @@
               <w:rPr>
                 <w:sz w:val="20"/>
               </w:rPr>
-              <w:t>0.9836 ± 0.0002</w:t>
+              <w:t>0.9836 +/- 0.0002</w:t>
             </w:r>
           </w:p>
         </w:tc>
@@ -2862,7 +2877,7 @@
               <w:rPr>
                 <w:sz w:val="20"/>
               </w:rPr>
-              <w:t>0.581 ± 0.002</w:t>
+              <w:t>0.581 +/- 0.002</w:t>
             </w:r>
           </w:p>
         </w:tc>
@@ -2914,7 +2929,7 @@
               <w:rPr>
                 <w:sz w:val="20"/>
               </w:rPr>
-              <w:t>0.9802 ± 0.0002</w:t>
+              <w:t>0.9802 +/- 0.0002</w:t>
             </w:r>
           </w:p>
         </w:tc>
@@ -2931,7 +2946,7 @@
               <w:rPr>
                 <w:sz w:val="20"/>
               </w:rPr>
-              <w:t>0.581 ± 0.003</w:t>
+              <w:t>0.581 +/- 0.003</w:t>
             </w:r>
           </w:p>
         </w:tc>
@@ -2984,7 +2999,7 @@
               <w:rPr>
                 <w:sz w:val="20"/>
               </w:rPr>
-              <w:t>0.9815 ± 0.0003</w:t>
+              <w:t>0.9815 +/- 0.0003</w:t>
             </w:r>
           </w:p>
         </w:tc>
@@ -3001,7 +3016,7 @@
               <w:rPr>
                 <w:sz w:val="20"/>
               </w:rPr>
-              <w:t>0.655 ± 0.001</w:t>
+              <w:t>0.655 +/- 0.001</w:t>
             </w:r>
           </w:p>
         </w:tc>
@@ -3054,7 +3069,7 @@
               <w:rPr>
                 <w:sz w:val="20"/>
               </w:rPr>
-              <w:t>0.9820 ± 0.0005</w:t>
+              <w:t>0.9820 +/- 0.0005</w:t>
             </w:r>
           </w:p>
         </w:tc>
@@ -3071,7 +3086,7 @@
               <w:rPr>
                 <w:sz w:val="20"/>
               </w:rPr>
-              <w:t>0.655 ± 0.001</w:t>
+              <w:t>0.655 +/- 0.001</w:t>
             </w:r>
           </w:p>
         </w:tc>
@@ -3126,7 +3141,7 @@
                 <w:b/>
                 <w:sz w:val="20"/>
               </w:rPr>
-              <w:t>0.9831 ± 0.0005</w:t>
+              <w:t>0.9831 +/- 0.0005</w:t>
             </w:r>
           </w:p>
         </w:tc>
@@ -3144,7 +3159,7 @@
                 <w:b/>
                 <w:sz w:val="20"/>
               </w:rPr>
-              <w:t>0.667 ± 0.002</w:t>
+              <w:t>0.667 +/- 0.002</w:t>
             </w:r>
           </w:p>
         </w:tc>
@@ -3198,7 +3213,7 @@
               <w:rPr>
                 <w:sz w:val="20"/>
               </w:rPr>
-              <w:t>0.9804 ± 0.0000</w:t>
+              <w:t>0.9804 +/- 0.0000</w:t>
             </w:r>
           </w:p>
         </w:tc>
@@ -3215,7 +3230,7 @@
               <w:rPr>
                 <w:sz w:val="20"/>
               </w:rPr>
-              <w:t>0.610 ± 0.003</w:t>
+              <w:t>0.610 +/- 0.003</w:t>
             </w:r>
           </w:p>
         </w:tc>
@@ -3268,7 +3283,7 @@
               <w:rPr>
                 <w:sz w:val="20"/>
               </w:rPr>
-              <w:t>0.9809 ± 0.0001</w:t>
+              <w:t>0.9809 +/- 0.0001</w:t>
             </w:r>
           </w:p>
         </w:tc>
@@ -3285,7 +3300,7 @@
               <w:rPr>
                 <w:sz w:val="20"/>
               </w:rPr>
-              <w:t>0.623 ± 0.003</w:t>
+              <w:t>0.623 +/- 0.003</w:t>
             </w:r>
           </w:p>
         </w:tc>
@@ -3768,7 +3783,7 @@
               <w:rPr>
                 <w:sz w:val="20"/>
               </w:rPr>
-              <w:t>0.9921 ± 0.0002</w:t>
+              <w:t>0.9921 +/- 0.0002</w:t>
             </w:r>
           </w:p>
         </w:tc>
@@ -3785,7 +3800,7 @@
               <w:rPr>
                 <w:sz w:val="20"/>
               </w:rPr>
-              <w:t>0.9928 ± 0.0002</w:t>
+              <w:t>0.9928 +/- 0.0002</w:t>
             </w:r>
           </w:p>
         </w:tc>
@@ -3821,7 +3836,7 @@
               <w:rPr>
                 <w:sz w:val="20"/>
               </w:rPr>
-              <w:t>0.535 ± 0.018</w:t>
+              <w:t>0.535 +/- 0.018</w:t>
             </w:r>
           </w:p>
         </w:tc>
@@ -3838,7 +3853,7 @@
               <w:rPr>
                 <w:sz w:val="20"/>
               </w:rPr>
-              <w:t>0.562 ± 0.008</w:t>
+              <w:t>0.562 +/- 0.008</w:t>
             </w:r>
           </w:p>
         </w:tc>
@@ -3874,7 +3889,7 @@
               <w:rPr>
                 <w:sz w:val="20"/>
               </w:rPr>
-              <w:t>0.9921 ± 0.0003</w:t>
+              <w:t>0.9921 +/- 0.0003</w:t>
             </w:r>
           </w:p>
         </w:tc>
@@ -3891,7 +3906,7 @@
               <w:rPr>
                 <w:sz w:val="20"/>
               </w:rPr>
-              <w:t>0.9929 ± 0.0001</w:t>
+              <w:t>0.9929 +/- 0.0001</w:t>
             </w:r>
           </w:p>
         </w:tc>
@@ -3939,7 +3954,7 @@
         <w:rPr>
           <w:i w:val="0"/>
         </w:rPr>
-        <w:t>Each row removes or replaces one part. Test scores at the best validation epoch, mean ± standard deviation over 3 seeds.</w:t>
+        <w:t>Each row removes or replaces one part. Test scores at the best validation epoch, mean +/- standard deviation over 3 seeds.</w:t>
       </w:r>
     </w:p>
     <w:tbl>
@@ -4064,7 +4079,7 @@
               <w:rPr>
                 <w:sz w:val="20"/>
               </w:rPr>
-              <w:t>0.9928 ± 0.0002</w:t>
+              <w:t>0.9928 +/- 0.0002</w:t>
             </w:r>
           </w:p>
         </w:tc>
@@ -4081,7 +4096,7 @@
               <w:rPr>
                 <w:sz w:val="20"/>
               </w:rPr>
-              <w:t>0.562 ± 0.008</w:t>
+              <w:t>0.562 +/- 0.008</w:t>
             </w:r>
           </w:p>
         </w:tc>
@@ -4136,7 +4151,7 @@
                 <w:b/>
                 <w:sz w:val="20"/>
               </w:rPr>
-              <w:t>0.9925 ± 0.0001</w:t>
+              <w:t>0.9925 +/- 0.0001</w:t>
             </w:r>
           </w:p>
         </w:tc>
@@ -4154,7 +4169,7 @@
                 <w:b/>
                 <w:sz w:val="20"/>
               </w:rPr>
-              <w:t>0.550 ± 0.004</w:t>
+              <w:t>0.550 +/- 0.004</w:t>
             </w:r>
           </w:p>
         </w:tc>
@@ -4208,7 +4223,7 @@
               <w:rPr>
                 <w:sz w:val="20"/>
               </w:rPr>
-              <w:t>0.9899 ± 0.0004</w:t>
+              <w:t>0.9899 +/- 0.0004</w:t>
             </w:r>
           </w:p>
         </w:tc>
@@ -4225,7 +4240,7 @@
               <w:rPr>
                 <w:sz w:val="20"/>
               </w:rPr>
-              <w:t>0.439 ± 0.009</w:t>
+              <w:t>0.439 +/- 0.009</w:t>
             </w:r>
           </w:p>
         </w:tc>
@@ -4278,7 +4293,7 @@
               <w:rPr>
                 <w:sz w:val="20"/>
               </w:rPr>
-              <w:t>0.9925 ± 0.0002</w:t>
+              <w:t>0.9925 +/- 0.0002</w:t>
             </w:r>
           </w:p>
         </w:tc>
@@ -4295,7 +4310,7 @@
               <w:rPr>
                 <w:sz w:val="20"/>
               </w:rPr>
-              <w:t>0.558 ± 0.006</w:t>
+              <w:t>0.558 +/- 0.006</w:t>
             </w:r>
           </w:p>
         </w:tc>
@@ -4348,7 +4363,7 @@
               <w:rPr>
                 <w:sz w:val="20"/>
               </w:rPr>
-              <w:t>0.9925 ± 0.0001</w:t>
+              <w:t>0.9925 +/- 0.0001</w:t>
             </w:r>
           </w:p>
         </w:tc>
@@ -4365,7 +4380,7 @@
               <w:rPr>
                 <w:sz w:val="20"/>
               </w:rPr>
-              <w:t>0.542 ± 0.006</w:t>
+              <w:t>0.542 +/- 0.006</w:t>
             </w:r>
           </w:p>
         </w:tc>
@@ -4418,7 +4433,7 @@
               <w:rPr>
                 <w:sz w:val="20"/>
               </w:rPr>
-              <w:t>0.9925 ± 0.0001</w:t>
+              <w:t>0.9925 +/- 0.0001</w:t>
             </w:r>
           </w:p>
         </w:tc>
@@ -4435,7 +4450,7 @@
               <w:rPr>
                 <w:sz w:val="20"/>
               </w:rPr>
-              <w:t>0.549 ± 0.018</w:t>
+              <w:t>0.549 +/- 0.018</w:t>
             </w:r>
           </w:p>
         </w:tc>
@@ -4488,7 +4503,7 @@
               <w:rPr>
                 <w:sz w:val="20"/>
               </w:rPr>
-              <w:t>0.9916 ± 0.0003</w:t>
+              <w:t>0.9916 +/- 0.0003</w:t>
             </w:r>
           </w:p>
         </w:tc>
@@ -4505,7 +4520,7 @@
               <w:rPr>
                 <w:sz w:val="20"/>
               </w:rPr>
-              <w:t>0.535 ± 0.008</w:t>
+              <w:t>0.535 +/- 0.008</w:t>
             </w:r>
           </w:p>
         </w:tc>
@@ -4558,7 +4573,7 @@
               <w:rPr>
                 <w:sz w:val="20"/>
               </w:rPr>
-              <w:t>0.9917 ± 0.0002</w:t>
+              <w:t>0.9917 +/- 0.0002</w:t>
             </w:r>
           </w:p>
         </w:tc>
@@ -4575,7 +4590,7 @@
               <w:rPr>
                 <w:sz w:val="20"/>
               </w:rPr>
-              <w:t>0.542 ± 0.004</w:t>
+              <w:t>0.542 +/- 0.004</w:t>
             </w:r>
           </w:p>
         </w:tc>
@@ -5236,7 +5251,7 @@
         <w:rPr>
           <w:i w:val="0"/>
         </w:rPr>
-        <w:t>The paper presents its residual mechanism as the answer to class imbalance. On our GTCN-G style model we changed only the loss (notebook unsw-nb15-gtcng-minority-classes): square-root class weights, balanced class weights, and a logit-adjusted loss (cross-entropy on logits plus the log of the class frequency, as proposed by Menon et al.), each decoded by the largest probability or after multiplying the probabilities by per-class scales tuned on the validation set for macro F1. The stopping epoch was chosen on validation macro F1. Test scores, mean ± standard deviation over 3 seeds.</w:t>
+        <w:t>The paper presents its residual mechanism as the answer to class imbalance. On our GTCN-G style model we changed only the loss (notebook unsw-nb15-gtcng-minority-classes): square-root class weights, balanced class weights, and a logit-adjusted loss (cross-entropy on logits plus the log of the class frequency, as proposed by Menon et al.), each decoded by the largest probability or after multiplying the probabilities by per-class scales tuned on the validation set for macro F1. The stopping epoch was chosen on validation macro F1. Test scores, mean +/- standard deviation over 3 seeds.</w:t>
       </w:r>
     </w:p>
     <w:tbl>
@@ -5438,7 +5453,7 @@
               <w:rPr>
                 <w:sz w:val="20"/>
               </w:rPr>
-              <w:t>0.9923 ± 0.0007</w:t>
+              <w:t>0.9923 +/- 0.0007</w:t>
             </w:r>
           </w:p>
         </w:tc>
@@ -5455,7 +5470,7 @@
               <w:rPr>
                 <w:sz w:val="20"/>
               </w:rPr>
-              <w:t>0.554 ± 0.018</w:t>
+              <w:t>0.554 +/- 0.018</w:t>
             </w:r>
           </w:p>
         </w:tc>
@@ -5559,7 +5574,7 @@
               <w:rPr>
                 <w:sz w:val="20"/>
               </w:rPr>
-              <w:t>0.9922 ± 0.0009</w:t>
+              <w:t>0.9922 +/- 0.0009</w:t>
             </w:r>
           </w:p>
         </w:tc>
@@ -5576,7 +5591,7 @@
               <w:rPr>
                 <w:sz w:val="20"/>
               </w:rPr>
-              <w:t>0.558 ± 0.037</w:t>
+              <w:t>0.558 +/- 0.037</w:t>
             </w:r>
           </w:p>
         </w:tc>
@@ -5680,7 +5695,7 @@
               <w:rPr>
                 <w:sz w:val="20"/>
               </w:rPr>
-              <w:t>0.9910 ± 0.0001</w:t>
+              <w:t>0.9910 +/- 0.0001</w:t>
             </w:r>
           </w:p>
         </w:tc>
@@ -5697,7 +5712,7 @@
               <w:rPr>
                 <w:sz w:val="20"/>
               </w:rPr>
-              <w:t>0.559 ± 0.005</w:t>
+              <w:t>0.559 +/- 0.005</w:t>
             </w:r>
           </w:p>
         </w:tc>
@@ -5801,7 +5816,7 @@
               <w:rPr>
                 <w:sz w:val="20"/>
               </w:rPr>
-              <w:t>0.9919 ± 0.0004</w:t>
+              <w:t>0.9919 +/- 0.0004</w:t>
             </w:r>
           </w:p>
         </w:tc>
@@ -5818,7 +5833,7 @@
               <w:rPr>
                 <w:sz w:val="20"/>
               </w:rPr>
-              <w:t>0.567 ± 0.001</w:t>
+              <w:t>0.567 +/- 0.001</w:t>
             </w:r>
           </w:p>
         </w:tc>
@@ -5922,7 +5937,7 @@
               <w:rPr>
                 <w:sz w:val="20"/>
               </w:rPr>
-              <w:t>0.9905 ± 0.0002</w:t>
+              <w:t>0.9905 +/- 0.0002</w:t>
             </w:r>
           </w:p>
         </w:tc>
@@ -5939,7 +5954,7 @@
               <w:rPr>
                 <w:sz w:val="20"/>
               </w:rPr>
-              <w:t>0.549 ± 0.007</w:t>
+              <w:t>0.549 +/- 0.007</w:t>
             </w:r>
           </w:p>
         </w:tc>
@@ -6043,7 +6058,7 @@
               <w:rPr>
                 <w:sz w:val="20"/>
               </w:rPr>
-              <w:t>0.9908 ± 0.0001</w:t>
+              <w:t>0.9908 +/- 0.0001</w:t>
             </w:r>
           </w:p>
         </w:tc>
@@ -6060,7 +6075,7 @@
               <w:rPr>
                 <w:sz w:val="20"/>
               </w:rPr>
-              <w:t>0.558 ± 0.006</w:t>
+              <w:t>0.558 +/- 0.006</w:t>
             </w:r>
           </w:p>
         </w:tc>
@@ -6164,7 +6179,7 @@
               <w:rPr>
                 <w:sz w:val="20"/>
               </w:rPr>
-              <w:t>0.9905 ± 0.0002</w:t>
+              <w:t>0.9905 +/- 0.0002</w:t>
             </w:r>
           </w:p>
         </w:tc>
@@ -6181,7 +6196,7 @@
               <w:rPr>
                 <w:sz w:val="20"/>
               </w:rPr>
-              <w:t>0.555 ± 0.008</w:t>
+              <w:t>0.555 +/- 0.008</w:t>
             </w:r>
           </w:p>
         </w:tc>
@@ -6285,7 +6300,7 @@
               <w:rPr>
                 <w:sz w:val="20"/>
               </w:rPr>
-              <w:t>0.9906 ± 0.0001</w:t>
+              <w:t>0.9906 +/- 0.0001</w:t>
             </w:r>
           </w:p>
         </w:tc>
@@ -6302,7 +6317,7 @@
               <w:rPr>
                 <w:sz w:val="20"/>
               </w:rPr>
-              <w:t>0.560 ± 0.004</w:t>
+              <w:t>0.560 +/- 0.004</w:t>
             </w:r>
           </w:p>
         </w:tc>
@@ -7477,7 +7492,43 @@
         <w:spacing w:after="40"/>
       </w:pPr>
       <w:r>
-        <w:t>The bound applies to the 45 features of one flow. The graph could in principle add information; in our runs it added about 0.001 weighted F1 and did not lift Analysis or Backdoor.</w:t>
+        <w:t>The raw columns that our preprocessing dropped (state, loss counts, window, TCP sequence numbers, round-trip time, flag columns, source port) do not remove the overlap: with them added, the shares stay at 80.6% (Analysis), 84.5% (Backdoor) and 33.8% (DoS), and class-weighted LightGBM changes from macro F1 0.540 to 0.559 with Analysis F1 about 0.10 and Backdoor F1 0.02 to 0.04 (one seed; notebook unsw-nb15-dropped-features-check).</w:t>
+      </w:r>
+    </w:p>
+    <w:p>
+      <w:pPr>
+        <w:pStyle w:val="ListBullet"/>
+        <w:spacing w:after="40"/>
+      </w:pPr>
+      <w:r>
+        <w:t>The IP addresses do not remove it either: among the 1,445 flows with an identical-feature twin of another class, predicting the most common label of the group is right for 24.0% of them, and 24.7% when the (source IP, destination IP) pair is added to the group.</w:t>
+      </w:r>
+    </w:p>
+    <w:p>
+      <w:pPr>
+        <w:pStyle w:val="ListBullet"/>
+        <w:spacing w:after="40"/>
+      </w:pPr>
+      <w:r>
+        <w:t>A graph has little to work with here (notebook unsw-nb15-host-structure-check). The subset has 40 source and 44 destination IPs, and every attack class comes from 4 sources (Analysis from 2) to at most 10 destinations. A graph on (IP, port) endpoints has 589,428 nodes of which 67% hold a single flow; a graph on IP addresses has 45 nodes with a median of 4,446 flows each. This fits the 0.001 weighted F1 that neighbours added in 6.3.</w:t>
+      </w:r>
+    </w:p>
+    <w:p>
+      <w:pPr>
+        <w:pStyle w:val="ListBullet"/>
+        <w:spacing w:after="40"/>
+      </w:pPr>
+      <w:r>
+        <w:t>Time order does not help: the share of flows whose previous flow from the same source has the same label is 0.3% for Backdoor, 5.1% for DoS and 12.7% for Analysis, against 99.8% for Normal.</w:t>
+      </w:r>
+    </w:p>
+    <w:p>
+      <w:pPr>
+        <w:pStyle w:val="ListBullet"/>
+        <w:spacing w:after="40"/>
+      </w:pPr>
+      <w:r>
+        <w:t>The bound applies to the 45 features of one flow and to this subset. The graph could in principle add information; in our runs it added about 0.001 weighted F1 and did not lift Analysis or Backdoor.</w:t>
       </w:r>
     </w:p>
     <w:p>
@@ -7487,6 +7538,1553 @@
       </w:pPr>
       <w:r>
         <w:t>Worms has only 24 flows in the subset (about 6 in a test set of the paper's size), so its F1 is not a reliable number in any model.</w:t>
+      </w:r>
+    </w:p>
+    <w:p>
+      <w:pPr>
+        <w:pStyle w:val="Heading2"/>
+      </w:pPr>
+      <w:r>
+        <w:t>6.6 A set of classes instead of one label</w:t>
+      </w:r>
+    </w:p>
+    <w:p>
+      <w:r>
+        <w:rPr>
+          <w:i w:val="0"/>
+        </w:rPr>
+        <w:t>Since the features cannot name the class of many Analysis, Backdoor and DoS flows, we tested returning a set of possible classes with a stated coverage (class-conditional, or Mondrian, conformal prediction; notebook unsw-nb15-conformal-sets). LightGBM is trained on 85% of the training flows (15% for early stopping); the 127,578 validation flows are the calibration set and the 191,368 test flows are used once. For every class c, the set is built so that a flow of class c has c in its set with probability at least 1 - alpha, calibrated separately for each class.</w:t>
+      </w:r>
+    </w:p>
+    <w:p>
+      <w:r>
+        <w:rPr>
+          <w:i w:val="0"/>
+        </w:rPr>
+        <w:t>A first design, one set over all 10 classes, reached about the target coverage but is not useful: the mean set size is at least 2.0 for every class, Normal included, and almost no set holds a single class, because each rare class's threshold admits it for many flows. The second design first detects attacks and then forms a set over the 9 attack classes. Stage 1 (class-weighted binary LightGBM) has a threshold that detects each attack class with at least 0.95 probability and raises a false alarm on 0.4% to 0.5% of Normal flows. Stage 2 (class-weighted 9-class LightGBM trained on attack flows) is calibrated on the validation attack flows that stage 1 flags. Worms has 5 calibration flows, too few for a guarantee, so it is excluded from the guarantees. Mean over 3 seeds, test set, given that the flow was detected:</w:t>
+      </w:r>
+    </w:p>
+    <w:tbl>
+      <w:tblPr>
+        <w:tblStyle w:val="TableGrid"/>
+        <w:tblW w:type="auto" w:w="0"/>
+        <w:jc w:val="center"/>
+        <w:tblLook w:firstColumn="1" w:firstRow="1" w:lastColumn="0" w:lastRow="0" w:noHBand="0" w:noVBand="1" w:val="04A0"/>
+      </w:tblPr>
+      <w:tblGrid>
+        <w:gridCol w:w="1040"/>
+        <w:gridCol w:w="1040"/>
+        <w:gridCol w:w="1040"/>
+        <w:gridCol w:w="1040"/>
+        <w:gridCol w:w="1040"/>
+        <w:gridCol w:w="1040"/>
+        <w:gridCol w:w="1040"/>
+        <w:gridCol w:w="1040"/>
+        <w:gridCol w:w="1040"/>
+      </w:tblGrid>
+      <w:tr>
+        <w:tc>
+          <w:tcPr>
+            <w:tcW w:type="dxa" w:w="1584"/>
+            <w:shd w:val="clear" w:color="auto" w:fill="DCE6F1"/>
+          </w:tcPr>
+          <w:p>
+            <w:pPr>
+              <w:spacing w:after="20"/>
+            </w:pPr>
+            <w:r/>
+            <w:r>
+              <w:rPr>
+                <w:b/>
+                <w:sz w:val="20"/>
+              </w:rPr>
+              <w:t>Class</w:t>
+            </w:r>
+          </w:p>
+        </w:tc>
+        <w:tc>
+          <w:tcPr>
+            <w:tcW w:type="dxa" w:w="864"/>
+            <w:shd w:val="clear" w:color="auto" w:fill="DCE6F1"/>
+          </w:tcPr>
+          <w:p>
+            <w:pPr>
+              <w:spacing w:after="20"/>
+            </w:pPr>
+            <w:r/>
+            <w:r>
+              <w:rPr>
+                <w:b/>
+                <w:sz w:val="20"/>
+              </w:rPr>
+              <w:t>Test flows</w:t>
+            </w:r>
+          </w:p>
+        </w:tc>
+        <w:tc>
+          <w:tcPr>
+            <w:tcW w:type="dxa" w:w="1008"/>
+            <w:shd w:val="clear" w:color="auto" w:fill="DCE6F1"/>
+          </w:tcPr>
+          <w:p>
+            <w:pPr>
+              <w:spacing w:after="20"/>
+            </w:pPr>
+            <w:r/>
+            <w:r>
+              <w:rPr>
+                <w:b/>
+                <w:sz w:val="20"/>
+              </w:rPr>
+              <w:t>Detected</w:t>
+            </w:r>
+          </w:p>
+        </w:tc>
+        <w:tc>
+          <w:tcPr>
+            <w:tcW w:type="dxa" w:w="1008"/>
+            <w:shd w:val="clear" w:color="auto" w:fill="DCE6F1"/>
+          </w:tcPr>
+          <w:p>
+            <w:pPr>
+              <w:spacing w:after="20"/>
+            </w:pPr>
+            <w:r/>
+            <w:r>
+              <w:rPr>
+                <w:b/>
+                <w:sz w:val="20"/>
+              </w:rPr>
+              <w:t>One label (top 1)</w:t>
+            </w:r>
+          </w:p>
+        </w:tc>
+        <w:tc>
+          <w:tcPr>
+            <w:tcW w:type="dxa" w:w="792"/>
+            <w:shd w:val="clear" w:color="auto" w:fill="DCE6F1"/>
+          </w:tcPr>
+          <w:p>
+            <w:pPr>
+              <w:spacing w:after="20"/>
+            </w:pPr>
+            <w:r/>
+            <w:r>
+              <w:rPr>
+                <w:b/>
+                <w:sz w:val="20"/>
+              </w:rPr>
+              <w:t>Top 3</w:t>
+            </w:r>
+          </w:p>
+        </w:tc>
+        <w:tc>
+          <w:tcPr>
+            <w:tcW w:type="dxa" w:w="1008"/>
+            <w:shd w:val="clear" w:color="auto" w:fill="DCE6F1"/>
+          </w:tcPr>
+          <w:p>
+            <w:pPr>
+              <w:spacing w:after="20"/>
+            </w:pPr>
+            <w:r/>
+            <w:r>
+              <w:rPr>
+                <w:b/>
+                <w:sz w:val="20"/>
+              </w:rPr>
+              <w:t>Set size, alpha 0.10</w:t>
+            </w:r>
+          </w:p>
+        </w:tc>
+        <w:tc>
+          <w:tcPr>
+            <w:tcW w:type="dxa" w:w="1080"/>
+            <w:shd w:val="clear" w:color="auto" w:fill="DCE6F1"/>
+          </w:tcPr>
+          <w:p>
+            <w:pPr>
+              <w:spacing w:after="20"/>
+            </w:pPr>
+            <w:r/>
+            <w:r>
+              <w:rPr>
+                <w:b/>
+                <w:sz w:val="20"/>
+              </w:rPr>
+              <w:t>Coverage, alpha 0.10</w:t>
+            </w:r>
+          </w:p>
+        </w:tc>
+        <w:tc>
+          <w:tcPr>
+            <w:tcW w:type="dxa" w:w="1008"/>
+            <w:shd w:val="clear" w:color="auto" w:fill="DCE6F1"/>
+          </w:tcPr>
+          <w:p>
+            <w:pPr>
+              <w:spacing w:after="20"/>
+            </w:pPr>
+            <w:r/>
+            <w:r>
+              <w:rPr>
+                <w:b/>
+                <w:sz w:val="20"/>
+              </w:rPr>
+              <w:t>Set size, alpha 0.05</w:t>
+            </w:r>
+          </w:p>
+        </w:tc>
+        <w:tc>
+          <w:tcPr>
+            <w:tcW w:type="dxa" w:w="1080"/>
+            <w:shd w:val="clear" w:color="auto" w:fill="DCE6F1"/>
+          </w:tcPr>
+          <w:p>
+            <w:pPr>
+              <w:spacing w:after="20"/>
+            </w:pPr>
+            <w:r/>
+            <w:r>
+              <w:rPr>
+                <w:b/>
+                <w:sz w:val="20"/>
+              </w:rPr>
+              <w:t>Coverage, alpha 0.05</w:t>
+            </w:r>
+          </w:p>
+        </w:tc>
+      </w:tr>
+      <w:tr>
+        <w:tc>
+          <w:tcPr>
+            <w:tcW w:type="dxa" w:w="1584"/>
+          </w:tcPr>
+          <w:p>
+            <w:pPr>
+              <w:spacing w:after="20"/>
+            </w:pPr>
+            <w:r/>
+            <w:r>
+              <w:rPr>
+                <w:sz w:val="20"/>
+              </w:rPr>
+              <w:t>Analysis</w:t>
+            </w:r>
+          </w:p>
+        </w:tc>
+        <w:tc>
+          <w:tcPr>
+            <w:tcW w:type="dxa" w:w="864"/>
+          </w:tcPr>
+          <w:p>
+            <w:pPr>
+              <w:spacing w:after="20"/>
+            </w:pPr>
+            <w:r/>
+            <w:r>
+              <w:rPr>
+                <w:sz w:val="20"/>
+              </w:rPr>
+              <w:t>89</w:t>
+            </w:r>
+          </w:p>
+        </w:tc>
+        <w:tc>
+          <w:tcPr>
+            <w:tcW w:type="dxa" w:w="1008"/>
+          </w:tcPr>
+          <w:p>
+            <w:pPr>
+              <w:spacing w:after="20"/>
+            </w:pPr>
+            <w:r/>
+            <w:r>
+              <w:rPr>
+                <w:sz w:val="20"/>
+              </w:rPr>
+              <w:t>0.925</w:t>
+            </w:r>
+          </w:p>
+        </w:tc>
+        <w:tc>
+          <w:tcPr>
+            <w:tcW w:type="dxa" w:w="1008"/>
+          </w:tcPr>
+          <w:p>
+            <w:pPr>
+              <w:spacing w:after="20"/>
+            </w:pPr>
+            <w:r/>
+            <w:r>
+              <w:rPr>
+                <w:sz w:val="20"/>
+              </w:rPr>
+              <w:t>0.352</w:t>
+            </w:r>
+          </w:p>
+        </w:tc>
+        <w:tc>
+          <w:tcPr>
+            <w:tcW w:type="dxa" w:w="792"/>
+          </w:tcPr>
+          <w:p>
+            <w:pPr>
+              <w:spacing w:after="20"/>
+            </w:pPr>
+            <w:r/>
+            <w:r>
+              <w:rPr>
+                <w:sz w:val="20"/>
+              </w:rPr>
+              <w:t>0.975</w:t>
+            </w:r>
+          </w:p>
+        </w:tc>
+        <w:tc>
+          <w:tcPr>
+            <w:tcW w:type="dxa" w:w="1008"/>
+          </w:tcPr>
+          <w:p>
+            <w:pPr>
+              <w:spacing w:after="20"/>
+            </w:pPr>
+            <w:r/>
+            <w:r>
+              <w:rPr>
+                <w:sz w:val="20"/>
+              </w:rPr>
+              <w:t>2.63</w:t>
+            </w:r>
+          </w:p>
+        </w:tc>
+        <w:tc>
+          <w:tcPr>
+            <w:tcW w:type="dxa" w:w="1080"/>
+          </w:tcPr>
+          <w:p>
+            <w:pPr>
+              <w:spacing w:after="20"/>
+            </w:pPr>
+            <w:r/>
+            <w:r>
+              <w:rPr>
+                <w:sz w:val="20"/>
+              </w:rPr>
+              <w:t>0.887</w:t>
+            </w:r>
+          </w:p>
+        </w:tc>
+        <w:tc>
+          <w:tcPr>
+            <w:tcW w:type="dxa" w:w="1008"/>
+          </w:tcPr>
+          <w:p>
+            <w:pPr>
+              <w:spacing w:after="20"/>
+            </w:pPr>
+            <w:r/>
+            <w:r>
+              <w:rPr>
+                <w:sz w:val="20"/>
+              </w:rPr>
+              <w:t>3.54</w:t>
+            </w:r>
+          </w:p>
+        </w:tc>
+        <w:tc>
+          <w:tcPr>
+            <w:tcW w:type="dxa" w:w="1080"/>
+          </w:tcPr>
+          <w:p>
+            <w:pPr>
+              <w:spacing w:after="20"/>
+            </w:pPr>
+            <w:r/>
+            <w:r>
+              <w:rPr>
+                <w:sz w:val="20"/>
+              </w:rPr>
+              <w:t>0.947</w:t>
+            </w:r>
+          </w:p>
+        </w:tc>
+      </w:tr>
+      <w:tr>
+        <w:tc>
+          <w:tcPr>
+            <w:tcW w:type="dxa" w:w="1584"/>
+          </w:tcPr>
+          <w:p>
+            <w:pPr>
+              <w:spacing w:after="20"/>
+            </w:pPr>
+            <w:r/>
+            <w:r>
+              <w:rPr>
+                <w:sz w:val="20"/>
+              </w:rPr>
+              <w:t>Backdoor</w:t>
+            </w:r>
+          </w:p>
+        </w:tc>
+        <w:tc>
+          <w:tcPr>
+            <w:tcW w:type="dxa" w:w="864"/>
+          </w:tcPr>
+          <w:p>
+            <w:pPr>
+              <w:spacing w:after="20"/>
+            </w:pPr>
+            <w:r/>
+            <w:r>
+              <w:rPr>
+                <w:sz w:val="20"/>
+              </w:rPr>
+              <w:t>89</w:t>
+            </w:r>
+          </w:p>
+        </w:tc>
+        <w:tc>
+          <w:tcPr>
+            <w:tcW w:type="dxa" w:w="1008"/>
+          </w:tcPr>
+          <w:p>
+            <w:pPr>
+              <w:spacing w:after="20"/>
+            </w:pPr>
+            <w:r/>
+            <w:r>
+              <w:rPr>
+                <w:sz w:val="20"/>
+              </w:rPr>
+              <w:t>0.993</w:t>
+            </w:r>
+          </w:p>
+        </w:tc>
+        <w:tc>
+          <w:tcPr>
+            <w:tcW w:type="dxa" w:w="1008"/>
+          </w:tcPr>
+          <w:p>
+            <w:pPr>
+              <w:spacing w:after="20"/>
+            </w:pPr>
+            <w:r/>
+            <w:r>
+              <w:rPr>
+                <w:sz w:val="20"/>
+              </w:rPr>
+              <w:t>0.200</w:t>
+            </w:r>
+          </w:p>
+        </w:tc>
+        <w:tc>
+          <w:tcPr>
+            <w:tcW w:type="dxa" w:w="792"/>
+          </w:tcPr>
+          <w:p>
+            <w:pPr>
+              <w:spacing w:after="20"/>
+            </w:pPr>
+            <w:r/>
+            <w:r>
+              <w:rPr>
+                <w:sz w:val="20"/>
+              </w:rPr>
+              <w:t>0.860</w:t>
+            </w:r>
+          </w:p>
+        </w:tc>
+        <w:tc>
+          <w:tcPr>
+            <w:tcW w:type="dxa" w:w="1008"/>
+          </w:tcPr>
+          <w:p>
+            <w:pPr>
+              <w:spacing w:after="20"/>
+            </w:pPr>
+            <w:r/>
+            <w:r>
+              <w:rPr>
+                <w:sz w:val="20"/>
+              </w:rPr>
+              <w:t>2.69</w:t>
+            </w:r>
+          </w:p>
+        </w:tc>
+        <w:tc>
+          <w:tcPr>
+            <w:tcW w:type="dxa" w:w="1080"/>
+          </w:tcPr>
+          <w:p>
+            <w:pPr>
+              <w:spacing w:after="20"/>
+            </w:pPr>
+            <w:r/>
+            <w:r>
+              <w:rPr>
+                <w:sz w:val="20"/>
+              </w:rPr>
+              <w:t>0.830</w:t>
+            </w:r>
+          </w:p>
+        </w:tc>
+        <w:tc>
+          <w:tcPr>
+            <w:tcW w:type="dxa" w:w="1008"/>
+          </w:tcPr>
+          <w:p>
+            <w:pPr>
+              <w:spacing w:after="20"/>
+            </w:pPr>
+            <w:r/>
+            <w:r>
+              <w:rPr>
+                <w:sz w:val="20"/>
+              </w:rPr>
+              <w:t>3.55</w:t>
+            </w:r>
+          </w:p>
+        </w:tc>
+        <w:tc>
+          <w:tcPr>
+            <w:tcW w:type="dxa" w:w="1080"/>
+          </w:tcPr>
+          <w:p>
+            <w:pPr>
+              <w:spacing w:after="20"/>
+            </w:pPr>
+            <w:r/>
+            <w:r>
+              <w:rPr>
+                <w:sz w:val="20"/>
+              </w:rPr>
+              <w:t>0.879</w:t>
+            </w:r>
+          </w:p>
+        </w:tc>
+      </w:tr>
+      <w:tr>
+        <w:tc>
+          <w:tcPr>
+            <w:tcW w:type="dxa" w:w="1584"/>
+          </w:tcPr>
+          <w:p>
+            <w:pPr>
+              <w:spacing w:after="20"/>
+            </w:pPr>
+            <w:r/>
+            <w:r>
+              <w:rPr>
+                <w:sz w:val="20"/>
+              </w:rPr>
+              <w:t>DoS</w:t>
+            </w:r>
+          </w:p>
+        </w:tc>
+        <w:tc>
+          <w:tcPr>
+            <w:tcW w:type="dxa" w:w="864"/>
+          </w:tcPr>
+          <w:p>
+            <w:pPr>
+              <w:spacing w:after="20"/>
+            </w:pPr>
+            <w:r/>
+            <w:r>
+              <w:rPr>
+                <w:sz w:val="20"/>
+              </w:rPr>
+              <w:t>247</w:t>
+            </w:r>
+          </w:p>
+        </w:tc>
+        <w:tc>
+          <w:tcPr>
+            <w:tcW w:type="dxa" w:w="1008"/>
+          </w:tcPr>
+          <w:p>
+            <w:pPr>
+              <w:spacing w:after="20"/>
+            </w:pPr>
+            <w:r/>
+            <w:r>
+              <w:rPr>
+                <w:sz w:val="20"/>
+              </w:rPr>
+              <w:t>0.989</w:t>
+            </w:r>
+          </w:p>
+        </w:tc>
+        <w:tc>
+          <w:tcPr>
+            <w:tcW w:type="dxa" w:w="1008"/>
+          </w:tcPr>
+          <w:p>
+            <w:pPr>
+              <w:spacing w:after="20"/>
+            </w:pPr>
+            <w:r/>
+            <w:r>
+              <w:rPr>
+                <w:sz w:val="20"/>
+              </w:rPr>
+              <w:t>0.248</w:t>
+            </w:r>
+          </w:p>
+        </w:tc>
+        <w:tc>
+          <w:tcPr>
+            <w:tcW w:type="dxa" w:w="792"/>
+          </w:tcPr>
+          <w:p>
+            <w:pPr>
+              <w:spacing w:after="20"/>
+            </w:pPr>
+            <w:r/>
+            <w:r>
+              <w:rPr>
+                <w:sz w:val="20"/>
+              </w:rPr>
+              <w:t>0.981</w:t>
+            </w:r>
+          </w:p>
+        </w:tc>
+        <w:tc>
+          <w:tcPr>
+            <w:tcW w:type="dxa" w:w="1008"/>
+          </w:tcPr>
+          <w:p>
+            <w:pPr>
+              <w:spacing w:after="20"/>
+            </w:pPr>
+            <w:r/>
+            <w:r>
+              <w:rPr>
+                <w:sz w:val="20"/>
+              </w:rPr>
+              <w:t>2.28</w:t>
+            </w:r>
+          </w:p>
+        </w:tc>
+        <w:tc>
+          <w:tcPr>
+            <w:tcW w:type="dxa" w:w="1080"/>
+          </w:tcPr>
+          <w:p>
+            <w:pPr>
+              <w:spacing w:after="20"/>
+            </w:pPr>
+            <w:r/>
+            <w:r>
+              <w:rPr>
+                <w:sz w:val="20"/>
+              </w:rPr>
+              <w:t>0.916</w:t>
+            </w:r>
+          </w:p>
+        </w:tc>
+        <w:tc>
+          <w:tcPr>
+            <w:tcW w:type="dxa" w:w="1008"/>
+          </w:tcPr>
+          <w:p>
+            <w:pPr>
+              <w:spacing w:after="20"/>
+            </w:pPr>
+            <w:r/>
+            <w:r>
+              <w:rPr>
+                <w:sz w:val="20"/>
+              </w:rPr>
+              <w:t>2.90</w:t>
+            </w:r>
+          </w:p>
+        </w:tc>
+        <w:tc>
+          <w:tcPr>
+            <w:tcW w:type="dxa" w:w="1080"/>
+          </w:tcPr>
+          <w:p>
+            <w:pPr>
+              <w:spacing w:after="20"/>
+            </w:pPr>
+            <w:r/>
+            <w:r>
+              <w:rPr>
+                <w:sz w:val="20"/>
+              </w:rPr>
+              <w:t>0.956</w:t>
+            </w:r>
+          </w:p>
+        </w:tc>
+      </w:tr>
+      <w:tr>
+        <w:tc>
+          <w:tcPr>
+            <w:tcW w:type="dxa" w:w="1584"/>
+          </w:tcPr>
+          <w:p>
+            <w:pPr>
+              <w:spacing w:after="20"/>
+            </w:pPr>
+            <w:r/>
+            <w:r>
+              <w:rPr>
+                <w:sz w:val="20"/>
+              </w:rPr>
+              <w:t>Exploits</w:t>
+            </w:r>
+          </w:p>
+        </w:tc>
+        <w:tc>
+          <w:tcPr>
+            <w:tcW w:type="dxa" w:w="864"/>
+          </w:tcPr>
+          <w:p>
+            <w:pPr>
+              <w:spacing w:after="20"/>
+            </w:pPr>
+            <w:r/>
+            <w:r>
+              <w:rPr>
+                <w:sz w:val="20"/>
+              </w:rPr>
+              <w:t>1,212</w:t>
+            </w:r>
+          </w:p>
+        </w:tc>
+        <w:tc>
+          <w:tcPr>
+            <w:tcW w:type="dxa" w:w="1008"/>
+          </w:tcPr>
+          <w:p>
+            <w:pPr>
+              <w:spacing w:after="20"/>
+            </w:pPr>
+            <w:r/>
+            <w:r>
+              <w:rPr>
+                <w:sz w:val="20"/>
+              </w:rPr>
+              <w:t>0.999</w:t>
+            </w:r>
+          </w:p>
+        </w:tc>
+        <w:tc>
+          <w:tcPr>
+            <w:tcW w:type="dxa" w:w="1008"/>
+          </w:tcPr>
+          <w:p>
+            <w:pPr>
+              <w:spacing w:after="20"/>
+            </w:pPr>
+            <w:r/>
+            <w:r>
+              <w:rPr>
+                <w:sz w:val="20"/>
+              </w:rPr>
+              <w:t>0.755</w:t>
+            </w:r>
+          </w:p>
+        </w:tc>
+        <w:tc>
+          <w:tcPr>
+            <w:tcW w:type="dxa" w:w="792"/>
+          </w:tcPr>
+          <w:p>
+            <w:pPr>
+              <w:spacing w:after="20"/>
+            </w:pPr>
+            <w:r/>
+            <w:r>
+              <w:rPr>
+                <w:sz w:val="20"/>
+              </w:rPr>
+              <w:t>0.919</w:t>
+            </w:r>
+          </w:p>
+        </w:tc>
+        <w:tc>
+          <w:tcPr>
+            <w:tcW w:type="dxa" w:w="1008"/>
+          </w:tcPr>
+          <w:p>
+            <w:pPr>
+              <w:spacing w:after="20"/>
+            </w:pPr>
+            <w:r/>
+            <w:r>
+              <w:rPr>
+                <w:sz w:val="20"/>
+              </w:rPr>
+              <w:t>1.85</w:t>
+            </w:r>
+          </w:p>
+        </w:tc>
+        <w:tc>
+          <w:tcPr>
+            <w:tcW w:type="dxa" w:w="1080"/>
+          </w:tcPr>
+          <w:p>
+            <w:pPr>
+              <w:spacing w:after="20"/>
+            </w:pPr>
+            <w:r/>
+            <w:r>
+              <w:rPr>
+                <w:sz w:val="20"/>
+              </w:rPr>
+              <w:t>0.883</w:t>
+            </w:r>
+          </w:p>
+        </w:tc>
+        <w:tc>
+          <w:tcPr>
+            <w:tcW w:type="dxa" w:w="1008"/>
+          </w:tcPr>
+          <w:p>
+            <w:pPr>
+              <w:spacing w:after="20"/>
+            </w:pPr>
+            <w:r/>
+            <w:r>
+              <w:rPr>
+                <w:sz w:val="20"/>
+              </w:rPr>
+              <w:t>2.30</w:t>
+            </w:r>
+          </w:p>
+        </w:tc>
+        <w:tc>
+          <w:tcPr>
+            <w:tcW w:type="dxa" w:w="1080"/>
+          </w:tcPr>
+          <w:p>
+            <w:pPr>
+              <w:spacing w:after="20"/>
+            </w:pPr>
+            <w:r/>
+            <w:r>
+              <w:rPr>
+                <w:sz w:val="20"/>
+              </w:rPr>
+              <w:t>0.939</w:t>
+            </w:r>
+          </w:p>
+        </w:tc>
+      </w:tr>
+      <w:tr>
+        <w:tc>
+          <w:tcPr>
+            <w:tcW w:type="dxa" w:w="1584"/>
+          </w:tcPr>
+          <w:p>
+            <w:pPr>
+              <w:spacing w:after="20"/>
+            </w:pPr>
+            <w:r/>
+            <w:r>
+              <w:rPr>
+                <w:sz w:val="20"/>
+              </w:rPr>
+              <w:t>Fuzzers</w:t>
+            </w:r>
+          </w:p>
+        </w:tc>
+        <w:tc>
+          <w:tcPr>
+            <w:tcW w:type="dxa" w:w="864"/>
+          </w:tcPr>
+          <w:p>
+            <w:pPr>
+              <w:spacing w:after="20"/>
+            </w:pPr>
+            <w:r/>
+            <w:r>
+              <w:rPr>
+                <w:sz w:val="20"/>
+              </w:rPr>
+              <w:t>1,197</w:t>
+            </w:r>
+          </w:p>
+        </w:tc>
+        <w:tc>
+          <w:tcPr>
+            <w:tcW w:type="dxa" w:w="1008"/>
+          </w:tcPr>
+          <w:p>
+            <w:pPr>
+              <w:spacing w:after="20"/>
+            </w:pPr>
+            <w:r/>
+            <w:r>
+              <w:rPr>
+                <w:sz w:val="20"/>
+              </w:rPr>
+              <w:t>0.986</w:t>
+            </w:r>
+          </w:p>
+        </w:tc>
+        <w:tc>
+          <w:tcPr>
+            <w:tcW w:type="dxa" w:w="1008"/>
+          </w:tcPr>
+          <w:p>
+            <w:pPr>
+              <w:spacing w:after="20"/>
+            </w:pPr>
+            <w:r/>
+            <w:r>
+              <w:rPr>
+                <w:sz w:val="20"/>
+              </w:rPr>
+              <w:t>0.909</w:t>
+            </w:r>
+          </w:p>
+        </w:tc>
+        <w:tc>
+          <w:tcPr>
+            <w:tcW w:type="dxa" w:w="792"/>
+          </w:tcPr>
+          <w:p>
+            <w:pPr>
+              <w:spacing w:after="20"/>
+            </w:pPr>
+            <w:r/>
+            <w:r>
+              <w:rPr>
+                <w:sz w:val="20"/>
+              </w:rPr>
+              <w:t>0.921</w:t>
+            </w:r>
+          </w:p>
+        </w:tc>
+        <w:tc>
+          <w:tcPr>
+            <w:tcW w:type="dxa" w:w="1008"/>
+          </w:tcPr>
+          <w:p>
+            <w:pPr>
+              <w:spacing w:after="20"/>
+            </w:pPr>
+            <w:r/>
+            <w:r>
+              <w:rPr>
+                <w:sz w:val="20"/>
+              </w:rPr>
+              <w:t>1.19</w:t>
+            </w:r>
+          </w:p>
+        </w:tc>
+        <w:tc>
+          <w:tcPr>
+            <w:tcW w:type="dxa" w:w="1080"/>
+          </w:tcPr>
+          <w:p>
+            <w:pPr>
+              <w:spacing w:after="20"/>
+            </w:pPr>
+            <w:r/>
+            <w:r>
+              <w:rPr>
+                <w:sz w:val="20"/>
+              </w:rPr>
+              <w:t>0.909</w:t>
+            </w:r>
+          </w:p>
+        </w:tc>
+        <w:tc>
+          <w:tcPr>
+            <w:tcW w:type="dxa" w:w="1008"/>
+          </w:tcPr>
+          <w:p>
+            <w:pPr>
+              <w:spacing w:after="20"/>
+            </w:pPr>
+            <w:r/>
+            <w:r>
+              <w:rPr>
+                <w:sz w:val="20"/>
+              </w:rPr>
+              <w:t>1.36</w:t>
+            </w:r>
+          </w:p>
+        </w:tc>
+        <w:tc>
+          <w:tcPr>
+            <w:tcW w:type="dxa" w:w="1080"/>
+          </w:tcPr>
+          <w:p>
+            <w:pPr>
+              <w:spacing w:after="20"/>
+            </w:pPr>
+            <w:r/>
+            <w:r>
+              <w:rPr>
+                <w:sz w:val="20"/>
+              </w:rPr>
+              <w:t>0.940</w:t>
+            </w:r>
+          </w:p>
+        </w:tc>
+      </w:tr>
+      <w:tr>
+        <w:tc>
+          <w:tcPr>
+            <w:tcW w:type="dxa" w:w="1584"/>
+          </w:tcPr>
+          <w:p>
+            <w:pPr>
+              <w:spacing w:after="20"/>
+            </w:pPr>
+            <w:r/>
+            <w:r>
+              <w:rPr>
+                <w:sz w:val="20"/>
+              </w:rPr>
+              <w:t>Generic</w:t>
+            </w:r>
+          </w:p>
+        </w:tc>
+        <w:tc>
+          <w:tcPr>
+            <w:tcW w:type="dxa" w:w="864"/>
+          </w:tcPr>
+          <w:p>
+            <w:pPr>
+              <w:spacing w:after="20"/>
+            </w:pPr>
+            <w:r/>
+            <w:r>
+              <w:rPr>
+                <w:sz w:val="20"/>
+              </w:rPr>
+              <w:t>592</w:t>
+            </w:r>
+          </w:p>
+        </w:tc>
+        <w:tc>
+          <w:tcPr>
+            <w:tcW w:type="dxa" w:w="1008"/>
+          </w:tcPr>
+          <w:p>
+            <w:pPr>
+              <w:spacing w:after="20"/>
+            </w:pPr>
+            <w:r/>
+            <w:r>
+              <w:rPr>
+                <w:sz w:val="20"/>
+              </w:rPr>
+              <w:t>1.000</w:t>
+            </w:r>
+          </w:p>
+        </w:tc>
+        <w:tc>
+          <w:tcPr>
+            <w:tcW w:type="dxa" w:w="1008"/>
+          </w:tcPr>
+          <w:p>
+            <w:pPr>
+              <w:spacing w:after="20"/>
+            </w:pPr>
+            <w:r/>
+            <w:r>
+              <w:rPr>
+                <w:sz w:val="20"/>
+              </w:rPr>
+              <w:t>0.863</w:t>
+            </w:r>
+          </w:p>
+        </w:tc>
+        <w:tc>
+          <w:tcPr>
+            <w:tcW w:type="dxa" w:w="792"/>
+          </w:tcPr>
+          <w:p>
+            <w:pPr>
+              <w:spacing w:after="20"/>
+            </w:pPr>
+            <w:r/>
+            <w:r>
+              <w:rPr>
+                <w:sz w:val="20"/>
+              </w:rPr>
+              <w:t>0.965</w:t>
+            </w:r>
+          </w:p>
+        </w:tc>
+        <w:tc>
+          <w:tcPr>
+            <w:tcW w:type="dxa" w:w="1008"/>
+          </w:tcPr>
+          <w:p>
+            <w:pPr>
+              <w:spacing w:after="20"/>
+            </w:pPr>
+            <w:r/>
+            <w:r>
+              <w:rPr>
+                <w:sz w:val="20"/>
+              </w:rPr>
+              <w:t>1.30</w:t>
+            </w:r>
+          </w:p>
+        </w:tc>
+        <w:tc>
+          <w:tcPr>
+            <w:tcW w:type="dxa" w:w="1080"/>
+          </w:tcPr>
+          <w:p>
+            <w:pPr>
+              <w:spacing w:after="20"/>
+            </w:pPr>
+            <w:r/>
+            <w:r>
+              <w:rPr>
+                <w:sz w:val="20"/>
+              </w:rPr>
+              <w:t>0.892</w:t>
+            </w:r>
+          </w:p>
+        </w:tc>
+        <w:tc>
+          <w:tcPr>
+            <w:tcW w:type="dxa" w:w="1008"/>
+          </w:tcPr>
+          <w:p>
+            <w:pPr>
+              <w:spacing w:after="20"/>
+            </w:pPr>
+            <w:r/>
+            <w:r>
+              <w:rPr>
+                <w:sz w:val="20"/>
+              </w:rPr>
+              <w:t>1.53</w:t>
+            </w:r>
+          </w:p>
+        </w:tc>
+        <w:tc>
+          <w:tcPr>
+            <w:tcW w:type="dxa" w:w="1080"/>
+          </w:tcPr>
+          <w:p>
+            <w:pPr>
+              <w:spacing w:after="20"/>
+            </w:pPr>
+            <w:r/>
+            <w:r>
+              <w:rPr>
+                <w:sz w:val="20"/>
+              </w:rPr>
+              <w:t>0.962</w:t>
+            </w:r>
+          </w:p>
+        </w:tc>
+      </w:tr>
+      <w:tr>
+        <w:tc>
+          <w:tcPr>
+            <w:tcW w:type="dxa" w:w="1584"/>
+          </w:tcPr>
+          <w:p>
+            <w:pPr>
+              <w:spacing w:after="20"/>
+            </w:pPr>
+            <w:r/>
+            <w:r>
+              <w:rPr>
+                <w:sz w:val="20"/>
+              </w:rPr>
+              <w:t>Reconnaissance</w:t>
+            </w:r>
+          </w:p>
+        </w:tc>
+        <w:tc>
+          <w:tcPr>
+            <w:tcW w:type="dxa" w:w="864"/>
+          </w:tcPr>
+          <w:p>
+            <w:pPr>
+              <w:spacing w:after="20"/>
+            </w:pPr>
+            <w:r/>
+            <w:r>
+              <w:rPr>
+                <w:sz w:val="20"/>
+              </w:rPr>
+              <w:t>522</w:t>
+            </w:r>
+          </w:p>
+        </w:tc>
+        <w:tc>
+          <w:tcPr>
+            <w:tcW w:type="dxa" w:w="1008"/>
+          </w:tcPr>
+          <w:p>
+            <w:pPr>
+              <w:spacing w:after="20"/>
+            </w:pPr>
+            <w:r/>
+            <w:r>
+              <w:rPr>
+                <w:sz w:val="20"/>
+              </w:rPr>
+              <w:t>0.999</w:t>
+            </w:r>
+          </w:p>
+        </w:tc>
+        <w:tc>
+          <w:tcPr>
+            <w:tcW w:type="dxa" w:w="1008"/>
+          </w:tcPr>
+          <w:p>
+            <w:pPr>
+              <w:spacing w:after="20"/>
+            </w:pPr>
+            <w:r/>
+            <w:r>
+              <w:rPr>
+                <w:sz w:val="20"/>
+              </w:rPr>
+              <w:t>0.921</w:t>
+            </w:r>
+          </w:p>
+        </w:tc>
+        <w:tc>
+          <w:tcPr>
+            <w:tcW w:type="dxa" w:w="792"/>
+          </w:tcPr>
+          <w:p>
+            <w:pPr>
+              <w:spacing w:after="20"/>
+            </w:pPr>
+            <w:r/>
+            <w:r>
+              <w:rPr>
+                <w:sz w:val="20"/>
+              </w:rPr>
+              <w:t>0.986</w:t>
+            </w:r>
+          </w:p>
+        </w:tc>
+        <w:tc>
+          <w:tcPr>
+            <w:tcW w:type="dxa" w:w="1008"/>
+          </w:tcPr>
+          <w:p>
+            <w:pPr>
+              <w:spacing w:after="20"/>
+            </w:pPr>
+            <w:r/>
+            <w:r>
+              <w:rPr>
+                <w:sz w:val="20"/>
+              </w:rPr>
+              <w:t>1.20</w:t>
+            </w:r>
+          </w:p>
+        </w:tc>
+        <w:tc>
+          <w:tcPr>
+            <w:tcW w:type="dxa" w:w="1080"/>
+          </w:tcPr>
+          <w:p>
+            <w:pPr>
+              <w:spacing w:after="20"/>
+            </w:pPr>
+            <w:r/>
+            <w:r>
+              <w:rPr>
+                <w:sz w:val="20"/>
+              </w:rPr>
+              <w:t>0.921</w:t>
+            </w:r>
+          </w:p>
+        </w:tc>
+        <w:tc>
+          <w:tcPr>
+            <w:tcW w:type="dxa" w:w="1008"/>
+          </w:tcPr>
+          <w:p>
+            <w:pPr>
+              <w:spacing w:after="20"/>
+            </w:pPr>
+            <w:r/>
+            <w:r>
+              <w:rPr>
+                <w:sz w:val="20"/>
+              </w:rPr>
+              <w:t>1.37</w:t>
+            </w:r>
+          </w:p>
+        </w:tc>
+        <w:tc>
+          <w:tcPr>
+            <w:tcW w:type="dxa" w:w="1080"/>
+          </w:tcPr>
+          <w:p>
+            <w:pPr>
+              <w:spacing w:after="20"/>
+            </w:pPr>
+            <w:r/>
+            <w:r>
+              <w:rPr>
+                <w:sz w:val="20"/>
+              </w:rPr>
+              <w:t>0.957</w:t>
+            </w:r>
+          </w:p>
+        </w:tc>
+      </w:tr>
+      <w:tr>
+        <w:tc>
+          <w:tcPr>
+            <w:tcW w:type="dxa" w:w="1584"/>
+          </w:tcPr>
+          <w:p>
+            <w:pPr>
+              <w:spacing w:after="20"/>
+            </w:pPr>
+            <w:r/>
+            <w:r>
+              <w:rPr>
+                <w:sz w:val="20"/>
+              </w:rPr>
+              <w:t>Shellcode</w:t>
+            </w:r>
+          </w:p>
+        </w:tc>
+        <w:tc>
+          <w:tcPr>
+            <w:tcW w:type="dxa" w:w="864"/>
+          </w:tcPr>
+          <w:p>
+            <w:pPr>
+              <w:spacing w:after="20"/>
+            </w:pPr>
+            <w:r/>
+            <w:r>
+              <w:rPr>
+                <w:sz w:val="20"/>
+              </w:rPr>
+              <w:t>67</w:t>
+            </w:r>
+          </w:p>
+        </w:tc>
+        <w:tc>
+          <w:tcPr>
+            <w:tcW w:type="dxa" w:w="1008"/>
+          </w:tcPr>
+          <w:p>
+            <w:pPr>
+              <w:spacing w:after="20"/>
+            </w:pPr>
+            <w:r/>
+            <w:r>
+              <w:rPr>
+                <w:sz w:val="20"/>
+              </w:rPr>
+              <w:t>1.000</w:t>
+            </w:r>
+          </w:p>
+        </w:tc>
+        <w:tc>
+          <w:tcPr>
+            <w:tcW w:type="dxa" w:w="1008"/>
+          </w:tcPr>
+          <w:p>
+            <w:pPr>
+              <w:spacing w:after="20"/>
+            </w:pPr>
+            <w:r/>
+            <w:r>
+              <w:rPr>
+                <w:sz w:val="20"/>
+              </w:rPr>
+              <w:t>0.915</w:t>
+            </w:r>
+          </w:p>
+        </w:tc>
+        <w:tc>
+          <w:tcPr>
+            <w:tcW w:type="dxa" w:w="792"/>
+          </w:tcPr>
+          <w:p>
+            <w:pPr>
+              <w:spacing w:after="20"/>
+            </w:pPr>
+            <w:r/>
+            <w:r>
+              <w:rPr>
+                <w:sz w:val="20"/>
+              </w:rPr>
+              <w:t>0.950</w:t>
+            </w:r>
+          </w:p>
+        </w:tc>
+        <w:tc>
+          <w:tcPr>
+            <w:tcW w:type="dxa" w:w="1008"/>
+          </w:tcPr>
+          <w:p>
+            <w:pPr>
+              <w:spacing w:after="20"/>
+            </w:pPr>
+            <w:r/>
+            <w:r>
+              <w:rPr>
+                <w:sz w:val="20"/>
+              </w:rPr>
+              <w:t>1.12</w:t>
+            </w:r>
+          </w:p>
+        </w:tc>
+        <w:tc>
+          <w:tcPr>
+            <w:tcW w:type="dxa" w:w="1080"/>
+          </w:tcPr>
+          <w:p>
+            <w:pPr>
+              <w:spacing w:after="20"/>
+            </w:pPr>
+            <w:r/>
+            <w:r>
+              <w:rPr>
+                <w:sz w:val="20"/>
+              </w:rPr>
+              <w:t>0.915</w:t>
+            </w:r>
+          </w:p>
+        </w:tc>
+        <w:tc>
+          <w:tcPr>
+            <w:tcW w:type="dxa" w:w="1008"/>
+          </w:tcPr>
+          <w:p>
+            <w:pPr>
+              <w:spacing w:after="20"/>
+            </w:pPr>
+            <w:r/>
+            <w:r>
+              <w:rPr>
+                <w:sz w:val="20"/>
+              </w:rPr>
+              <w:t>1.38</w:t>
+            </w:r>
+          </w:p>
+        </w:tc>
+        <w:tc>
+          <w:tcPr>
+            <w:tcW w:type="dxa" w:w="1080"/>
+          </w:tcPr>
+          <w:p>
+            <w:pPr>
+              <w:spacing w:after="20"/>
+            </w:pPr>
+            <w:r/>
+            <w:r>
+              <w:rPr>
+                <w:sz w:val="20"/>
+              </w:rPr>
+              <w:t>0.920</w:t>
+            </w:r>
+          </w:p>
+        </w:tc>
+      </w:tr>
+    </w:tbl>
+    <w:p>
+      <w:pPr>
+        <w:spacing w:after="40"/>
+      </w:pPr>
+    </w:p>
+    <w:p>
+      <w:pPr>
+        <w:jc w:val="center"/>
+      </w:pPr>
+      <w:r>
+        <w:drawing>
+          <wp:inline xmlns:a="http://schemas.openxmlformats.org/drawingml/2006/main" xmlns:pic="http://schemas.openxmlformats.org/drawingml/2006/picture">
+            <wp:extent cx="5852160" cy="1375914"/>
+            <wp:docPr id="4" name="Picture 4"/>
+            <wp:cNvGraphicFramePr>
+              <a:graphicFrameLocks noChangeAspect="1"/>
+            </wp:cNvGraphicFramePr>
+            <a:graphic>
+              <a:graphicData uri="http://schemas.openxmlformats.org/drawingml/2006/picture">
+                <pic:pic>
+                  <pic:nvPicPr>
+                    <pic:cNvPr id="0" name="fig_03.png"/>
+                    <pic:cNvPicPr/>
+                  </pic:nvPicPr>
+                  <pic:blipFill>
+                    <a:blip r:embed="rId12"/>
+                    <a:stretch>
+                      <a:fillRect/>
+                    </a:stretch>
+                  </pic:blipFill>
+                  <pic:spPr>
+                    <a:xfrm>
+                      <a:off x="0" y="0"/>
+                      <a:ext cx="5852160" cy="1375914"/>
+                    </a:xfrm>
+                    <a:prstGeom prst="rect"/>
+                  </pic:spPr>
+                </pic:pic>
+              </a:graphicData>
+            </a:graphic>
+          </wp:inline>
+        </w:drawing>
+      </w:r>
+    </w:p>
+    <w:p>
+      <w:pPr>
+        <w:jc w:val="center"/>
+      </w:pPr>
+      <w:r>
+        <w:rPr>
+          <w:i/>
+          <w:sz w:val="19"/>
+        </w:rPr>
+        <w:t>Figure 4. Design 2: end-to-end coverage (flagged and class in the set), mean set size and share of flows flagged as attacks, by class (mean and standard deviation over 3 seeds).</w:t>
+      </w:r>
+    </w:p>
+    <w:p>
+      <w:r>
+        <w:rPr>
+          <w:i w:val="0"/>
+        </w:rPr>
+        <w:t>'One label (top 1)' and 'Top 3' are the shares of detected flows whose true class is the most probable class, or among the three most probable, of the 9 attack classes.</w:t>
+      </w:r>
+    </w:p>
+    <w:p>
+      <w:pPr>
+        <w:pStyle w:val="ListBullet"/>
+        <w:spacing w:after="40"/>
+      </w:pPr>
+      <w:r>
+        <w:t>For Analysis, Backdoor and DoS, a single label is right for 20% to 35% of detected flows, while a set of about 2.3 to 2.7 attack classes holds the true class for 83% to 92% of them at alpha 0.10, and the three most probable classes hold it for 86% to 98%. For Fuzzers, Generic, Reconnaissance and Shellcode the sets are almost always one or two classes.</w:t>
+      </w:r>
+    </w:p>
+    <w:p>
+      <w:pPr>
+        <w:pStyle w:val="ListBullet"/>
+        <w:spacing w:after="40"/>
+      </w:pPr>
+      <w:r>
+        <w:t>The sets are not more efficient than a fixed top-k. For Analysis, a set of 2.63 classes covers 0.887, which is what interpolating between top 2 (0.736) and top 3 (0.975) gives. They add an adaptive size and a coverage statement, not information that the features lack.</w:t>
+      </w:r>
+    </w:p>
+    <w:p>
+      <w:pPr>
+        <w:pStyle w:val="ListBullet"/>
+        <w:spacing w:after="40"/>
+      </w:pPr>
+      <w:r>
+        <w:t>Coverage is close to the target but not guaranteed on a finite test set. Backdoor is lowest (0.830 against 0.90 at alpha 0.10; 0.879 against 0.95 at alpha 0.05); its calibration set has 59 flows and its test set 89, so realised coverage is uncertain by several points. Analysis is detected for 92.5% of its flows against a target of 95%, again within the sampling error of 89 flows.</w:t>
       </w:r>
     </w:p>
     <w:p>
@@ -7581,6 +9179,21 @@
         <w:rPr>
           <w:b/>
         </w:rPr>
+        <w:t xml:space="preserve">The scores stop because of the data. </w:t>
+      </w:r>
+      <w:r>
+        <w:t>The raw columns we dropped, the IP addresses and the time order do not separate the overlapping classes; the hosts are few; a loss change moves the boundary but adds no information. A set of classes, with a coverage statement, is a way to report this without forcing a label. It is not more efficient than a fixed top-3.</w:t>
+      </w:r>
+    </w:p>
+    <w:p>
+      <w:pPr>
+        <w:pStyle w:val="ListBullet"/>
+        <w:spacing w:after="40"/>
+      </w:pPr>
+      <w:r>
+        <w:rPr>
+          <w:b/>
+        </w:rPr>
         <w:t xml:space="preserve">What differs from the paper and could matter. </w:t>
       </w:r>
       <w:r>
@@ -7655,6 +9268,15 @@
         <w:spacing w:after="40"/>
       </w:pPr>
       <w:r>
+        <w:t>The conformal sets use one model family (LightGBM), one score (1 minus the probability), one random split (the validation and test flows come from the same draw, which the coverage statement needs), calibration sets of 58 to 59 flows for Analysis and Backdoor, a fixed calibration and test set across the 3 seeds, and Worms is excluded from the guarantees. We did not test whether the sets help an analyst.</w:t>
+      </w:r>
+    </w:p>
+    <w:p>
+      <w:pPr>
+        <w:pStyle w:val="ListBullet"/>
+        <w:spacing w:after="40"/>
+      </w:pPr>
+      <w:r>
         <w:t>LightGBM is unstable with many trees in our setup (the unweighted model gets worse as trees are added; the class-weighted one collapses after about 250 trees), so our LightGBM results rely on early stopping on validation.</w:t>
       </w:r>
     </w:p>
@@ -7708,7 +9330,7 @@
         <w:spacing w:after="40"/>
       </w:pPr>
       <w:r>
-        <w:t>Test whether neighbouring-flow information within a time window can separate Analysis and Backdoor from the flows they overlap with.</w:t>
+        <w:t>Repeat the conformal sets with more calibration flows for Analysis and Backdoor, other scores and the probabilities of the GNN, and test whether the sets help an analyst.</w:t>
       </w:r>
     </w:p>
     <w:p>
@@ -7724,7 +9346,7 @@
         <w:rPr>
           <w:i/>
         </w:rPr>
-        <w:t>"We replicated the stated setup of GTCN-G (5:2:3 split, E-GraphSAGE-M style baseline, batches of 500). The paper's data matches the first raw UNSW-NB15 file (700,001 flows, same class mix), so we repeated the work on that file. A model that predicts Normal for every flow would score about 0.953 weighted F1 there, above the 0.9512 the paper reports for GTCN-G, and our simple baseline scores 0.993. We implemented GTCN-G's main parts ourselves; the full model does not beat the simple baseline, the residual branch (the flow's own features) is the part that matters, and the graph adds about 0.001 weighted F1. Changes of the loss did not raise macro F1, and about 80% of Analysis and Backdoor flows have an identical-feature twin of another class, which caps their F1 at about 0.38 for any model on those features (ours reach about 0.2). These results use our own implementation and our own preprocessing (duplicates removed), so they are not a verdict on the authors' model."</w:t>
+        <w:t>"We replicated the stated setup of GTCN-G (5:2:3 split, E-GraphSAGE-M style baseline, batches of 500). The paper's data matches the first raw UNSW-NB15 file (700,001 flows, same class mix), so we repeated the work on that file. A model that predicts Normal for every flow would score about 0.953 weighted F1 there, above the 0.9512 the paper reports for GTCN-G, and our simple baseline scores 0.993. We implemented GTCN-G's main parts ourselves; the full model does not beat the simple baseline, the residual branch (the flow's own features) is the part that matters, and the graph adds about 0.001 weighted F1. Changes of the loss did not raise macro F1, and about 80% of Analysis and Backdoor flows have an identical-feature twin of another class, which caps their F1 at about 0.38 for any model on those features (ours reach about 0.2). Neither dropped raw columns, IP addresses nor time order separate them. Returning a set of about 2.3 to 2.7 attack classes instead of one label holds the true class of Analysis, Backdoor and DoS flows for 83% to 92% of detected flows (single label: 20% to 35%), but it is no more efficient than a fixed top-3. These results use our own implementation and our own preprocessing (duplicates removed), so they are not a verdict on the authors' model."</w:t>
       </w:r>
     </w:p>
     <w:sectPr>

</xml_diff>